<commit_message>
Added excel and ppt support in this project
</commit_message>
<xml_diff>
--- a/input/DummyFrench.docx
+++ b/input/DummyFrench.docx
@@ -68,7 +68,7 @@
                     </pic:cNvPicPr>
                   </pic:nvPicPr>
                   <pic:blipFill>
-                    <a:blip r:embed="rId4" cstate="print">
+                    <a:blip r:embed="rId6" cstate="print">
                       <a:extLst>
                         <a:ext uri="{28A0092B-C50C-407E-A947-70E740481C1C}">
                           <a14:useLocalDpi xmlns:a14="http://schemas.microsoft.com/office/drawing/2010/main" val="0"/>
@@ -177,6 +177,177 @@
         <w:t xml:space="preserve"> mes meilleurs amis dans un petit café chaleureux au coin de la rue pour discuter de nos projets futurs et partager des rires sincères.</w:t>
       </w:r>
     </w:p>
+    <w:tbl>
+      <w:tblPr>
+        <w:tblStyle w:val="GridTable4-Accent1"/>
+        <w:tblW w:w="5000" w:type="pct"/>
+        <w:tblLook w:val="04A0" w:firstRow="1" w:lastRow="0" w:firstColumn="1" w:lastColumn="0" w:noHBand="0" w:noVBand="1"/>
+      </w:tblPr>
+      <w:tblGrid>
+        <w:gridCol w:w="1747"/>
+        <w:gridCol w:w="1940"/>
+        <w:gridCol w:w="5663"/>
+      </w:tblGrid>
+      <w:tr>
+        <w:trPr>
+          <w:cnfStyle w:val="100000000000" w:firstRow="1" w:lastRow="0" w:firstColumn="0" w:lastColumn="0" w:oddVBand="0" w:evenVBand="0" w:oddHBand="0" w:evenHBand="0" w:firstRowFirstColumn="0" w:firstRowLastColumn="0" w:lastRowFirstColumn="0" w:lastRowLastColumn="0"/>
+        </w:trPr>
+        <w:tc>
+          <w:tcPr>
+            <w:cnfStyle w:val="001000000000" w:firstRow="0" w:lastRow="0" w:firstColumn="1" w:lastColumn="0" w:oddVBand="0" w:evenVBand="0" w:oddHBand="0" w:evenHBand="0" w:firstRowFirstColumn="0" w:firstRowLastColumn="0" w:lastRowFirstColumn="0" w:lastRowLastColumn="0"/>
+            <w:tcW w:w="0" w:type="auto"/>
+            <w:hideMark/>
+          </w:tcPr>
+          <w:p>
+            <w:pPr>
+              <w:spacing w:after="160"/>
+            </w:pPr>
+            <w:r>
+              <w:t>Français</w:t>
+            </w:r>
+          </w:p>
+        </w:tc>
+        <w:tc>
+          <w:tcPr>
+            <w:tcW w:w="0" w:type="auto"/>
+            <w:hideMark/>
+          </w:tcPr>
+          <w:p>
+            <w:pPr>
+              <w:spacing w:after="160"/>
+              <w:cnfStyle w:val="100000000000" w:firstRow="1" w:lastRow="0" w:firstColumn="0" w:lastColumn="0" w:oddVBand="0" w:evenVBand="0" w:oddHBand="0" w:evenHBand="0" w:firstRowFirstColumn="0" w:firstRowLastColumn="0" w:lastRowFirstColumn="0" w:lastRowLastColumn="0"/>
+            </w:pPr>
+            <w:r>
+              <w:t>Valeur</w:t>
+            </w:r>
+          </w:p>
+        </w:tc>
+        <w:tc>
+          <w:tcPr>
+            <w:tcW w:w="0" w:type="auto"/>
+            <w:hideMark/>
+          </w:tcPr>
+          <w:p>
+            <w:pPr>
+              <w:spacing w:after="160"/>
+              <w:cnfStyle w:val="100000000000" w:firstRow="1" w:lastRow="0" w:firstColumn="0" w:lastColumn="0" w:oddVBand="0" w:evenVBand="0" w:oddHBand="0" w:evenHBand="0" w:firstRowFirstColumn="0" w:firstRowLastColumn="0" w:lastRowFirstColumn="0" w:lastRowLastColumn="0"/>
+            </w:pPr>
+            <w:r>
+              <w:t>Phrase</w:t>
+            </w:r>
+          </w:p>
+        </w:tc>
+      </w:tr>
+      <w:tr>
+        <w:trPr>
+          <w:cnfStyle w:val="000000100000" w:firstRow="0" w:lastRow="0" w:firstColumn="0" w:lastColumn="0" w:oddVBand="0" w:evenVBand="0" w:oddHBand="1" w:evenHBand="0" w:firstRowFirstColumn="0" w:firstRowLastColumn="0" w:lastRowFirstColumn="0" w:lastRowLastColumn="0"/>
+        </w:trPr>
+        <w:tc>
+          <w:tcPr>
+            <w:cnfStyle w:val="001000000000" w:firstRow="0" w:lastRow="0" w:firstColumn="1" w:lastColumn="0" w:oddVBand="0" w:evenVBand="0" w:oddHBand="0" w:evenHBand="0" w:firstRowFirstColumn="0" w:firstRowLastColumn="0" w:lastRowFirstColumn="0" w:lastRowLastColumn="0"/>
+            <w:tcW w:w="0" w:type="auto"/>
+            <w:hideMark/>
+          </w:tcPr>
+          <w:p>
+            <w:pPr>
+              <w:spacing w:after="160"/>
+            </w:pPr>
+            <w:r>
+              <w:t>Bonjour</w:t>
+            </w:r>
+          </w:p>
+        </w:tc>
+        <w:tc>
+          <w:tcPr>
+            <w:tcW w:w="0" w:type="auto"/>
+            <w:hideMark/>
+          </w:tcPr>
+          <w:p>
+            <w:pPr>
+              <w:spacing w:after="160"/>
+              <w:cnfStyle w:val="000000100000" w:firstRow="0" w:lastRow="0" w:firstColumn="0" w:lastColumn="0" w:oddVBand="0" w:evenVBand="0" w:oddHBand="1" w:evenHBand="0" w:firstRowFirstColumn="0" w:firstRowLastColumn="0" w:lastRowFirstColumn="0" w:lastRowLastColumn="0"/>
+            </w:pPr>
+            <w:r>
+              <w:t>Salut</w:t>
+            </w:r>
+          </w:p>
+        </w:tc>
+        <w:tc>
+          <w:tcPr>
+            <w:tcW w:w="0" w:type="auto"/>
+            <w:hideMark/>
+          </w:tcPr>
+          <w:p>
+            <w:pPr>
+              <w:spacing w:after="160"/>
+              <w:cnfStyle w:val="000000100000" w:firstRow="0" w:lastRow="0" w:firstColumn="0" w:lastColumn="0" w:oddVBand="0" w:evenVBand="0" w:oddHBand="1" w:evenHBand="0" w:firstRowFirstColumn="0" w:firstRowLastColumn="0" w:lastRowFirstColumn="0" w:lastRowLastColumn="0"/>
+              <w:rPr>
+                <w:lang w:val="fr-FR"/>
+              </w:rPr>
+            </w:pPr>
+            <w:r>
+              <w:rPr>
+                <w:lang w:val="fr-FR"/>
+              </w:rPr>
+              <w:t>Bonjour ! Salut, comment vas-tu ?</w:t>
+            </w:r>
+          </w:p>
+        </w:tc>
+      </w:tr>
+      <w:tr>
+        <w:tc>
+          <w:tcPr>
+            <w:cnfStyle w:val="001000000000" w:firstRow="0" w:lastRow="0" w:firstColumn="1" w:lastColumn="0" w:oddVBand="0" w:evenVBand="0" w:oddHBand="0" w:evenHBand="0" w:firstRowFirstColumn="0" w:firstRowLastColumn="0" w:lastRowFirstColumn="0" w:lastRowLastColumn="0"/>
+            <w:tcW w:w="0" w:type="auto"/>
+            <w:hideMark/>
+          </w:tcPr>
+          <w:p>
+            <w:pPr>
+              <w:spacing w:after="160"/>
+            </w:pPr>
+            <w:r>
+              <w:t>Merci</w:t>
+            </w:r>
+          </w:p>
+        </w:tc>
+        <w:tc>
+          <w:tcPr>
+            <w:tcW w:w="0" w:type="auto"/>
+            <w:hideMark/>
+          </w:tcPr>
+          <w:p>
+            <w:pPr>
+              <w:spacing w:after="160"/>
+              <w:cnfStyle w:val="000000000000" w:firstRow="0" w:lastRow="0" w:firstColumn="0" w:lastColumn="0" w:oddVBand="0" w:evenVBand="0" w:oddHBand="0" w:evenHBand="0" w:firstRowFirstColumn="0" w:firstRowLastColumn="0" w:lastRowFirstColumn="0" w:lastRowLastColumn="0"/>
+            </w:pPr>
+            <w:r>
+              <w:t>Beaucoup</w:t>
+            </w:r>
+          </w:p>
+        </w:tc>
+        <w:tc>
+          <w:tcPr>
+            <w:tcW w:w="0" w:type="auto"/>
+            <w:hideMark/>
+          </w:tcPr>
+          <w:p>
+            <w:pPr>
+              <w:spacing w:after="160"/>
+              <w:cnfStyle w:val="000000000000" w:firstRow="0" w:lastRow="0" w:firstColumn="0" w:lastColumn="0" w:oddVBand="0" w:evenVBand="0" w:oddHBand="0" w:evenHBand="0" w:firstRowFirstColumn="0" w:firstRowLastColumn="0" w:lastRowFirstColumn="0" w:lastRowLastColumn="0"/>
+              <w:rPr>
+                <w:lang w:val="fr-FR"/>
+              </w:rPr>
+            </w:pPr>
+            <w:r>
+              <w:rPr>
+                <w:lang w:val="fr-FR"/>
+              </w:rPr>
+              <w:t>Merci beaucoup pour votre aide.</w:t>
+            </w:r>
+          </w:p>
+        </w:tc>
+      </w:tr>
+    </w:tbl>
     <w:p>
       <w:pPr>
         <w:rPr>
@@ -192,6 +363,56 @@
     </w:sectPr>
   </w:body>
 </w:document>
+</file>
+
+<file path=word/endnotes.xml><?xml version="1.0" encoding="utf-8"?>
+<w:endnotes xmlns:wpc="http://schemas.microsoft.com/office/word/2010/wordprocessingCanvas" xmlns:cx="http://schemas.microsoft.com/office/drawing/2014/chartex" xmlns:cx1="http://schemas.microsoft.com/office/drawing/2015/9/8/chartex" xmlns:cx2="http://schemas.microsoft.com/office/drawing/2015/10/21/chartex" xmlns:cx3="http://schemas.microsoft.com/office/drawing/2016/5/9/chartex" xmlns:cx4="http://schemas.microsoft.com/office/drawing/2016/5/10/chartex" xmlns:cx5="http://schemas.microsoft.com/office/drawing/2016/5/11/chartex" xmlns:cx6="http://schemas.microsoft.com/office/drawing/2016/5/12/chartex" xmlns:cx7="http://schemas.microsoft.com/office/drawing/2016/5/13/chartex" xmlns:cx8="http://schemas.microsoft.com/office/drawing/2016/5/14/chartex" xmlns:mc="http://schemas.openxmlformats.org/markup-compatibility/2006" xmlns:aink="http://schemas.microsoft.com/office/drawing/2016/ink" xmlns:am3d="http://schemas.microsoft.com/office/drawing/2017/model3d" xmlns:o="urn:schemas-microsoft-com:office:office" xmlns:oel="http://schemas.microsoft.com/office/2019/extlst" xmlns:r="http://schemas.openxmlformats.org/officeDocument/2006/relationships" xmlns:m="http://schemas.openxmlformats.org/officeDocument/2006/math" xmlns:v="urn:schemas-microsoft-com:vml" xmlns:wp14="http://schemas.microsoft.com/office/word/2010/wordprocessingDrawing" xmlns:wp="http://schemas.openxmlformats.org/drawingml/2006/wordprocessingDrawing" xmlns:w10="urn:schemas-microsoft-com:office:word" xmlns:w="http://schemas.openxmlformats.org/wordprocessingml/2006/main" xmlns:w14="http://schemas.microsoft.com/office/word/2010/wordml" xmlns:w15="http://schemas.microsoft.com/office/word/2012/wordml" xmlns:w16cex="http://schemas.microsoft.com/office/word/2018/wordml/cex" xmlns:w16cid="http://schemas.microsoft.com/office/word/2016/wordml/cid" xmlns:w16="http://schemas.microsoft.com/office/word/2018/wordml" xmlns:w16du="http://schemas.microsoft.com/office/word/2023/wordml/word16du" xmlns:w16sdtdh="http://schemas.microsoft.com/office/word/2020/wordml/sdtdatahash" xmlns:w16sdtfl="http://schemas.microsoft.com/office/word/2024/wordml/sdtformatlock" xmlns:w16se="http://schemas.microsoft.com/office/word/2015/wordml/symex" xmlns:wpg="http://schemas.microsoft.com/office/word/2010/wordprocessingGroup" xmlns:wpi="http://schemas.microsoft.com/office/word/2010/wordprocessingInk" xmlns:wne="http://schemas.microsoft.com/office/word/2006/wordml" xmlns:wps="http://schemas.microsoft.com/office/word/2010/wordprocessingShape" mc:Ignorable="w14 w15 w16se w16cid w16 w16cex w16sdtdh w16sdtfl w16du wp14">
+  <w:endnote w:type="separator" w:id="-1">
+    <w:p>
+      <w:pPr>
+        <w:spacing w:after="0" w:line="240" w:lineRule="auto"/>
+      </w:pPr>
+      <w:r>
+        <w:separator/>
+      </w:r>
+    </w:p>
+  </w:endnote>
+  <w:endnote w:type="continuationSeparator" w:id="0">
+    <w:p>
+      <w:pPr>
+        <w:spacing w:after="0" w:line="240" w:lineRule="auto"/>
+      </w:pPr>
+      <w:r>
+        <w:continuationSeparator/>
+      </w:r>
+    </w:p>
+  </w:endnote>
+</w:endnotes>
+</file>
+
+<file path=word/footnotes.xml><?xml version="1.0" encoding="utf-8"?>
+<w:footnotes xmlns:wpc="http://schemas.microsoft.com/office/word/2010/wordprocessingCanvas" xmlns:cx="http://schemas.microsoft.com/office/drawing/2014/chartex" xmlns:cx1="http://schemas.microsoft.com/office/drawing/2015/9/8/chartex" xmlns:cx2="http://schemas.microsoft.com/office/drawing/2015/10/21/chartex" xmlns:cx3="http://schemas.microsoft.com/office/drawing/2016/5/9/chartex" xmlns:cx4="http://schemas.microsoft.com/office/drawing/2016/5/10/chartex" xmlns:cx5="http://schemas.microsoft.com/office/drawing/2016/5/11/chartex" xmlns:cx6="http://schemas.microsoft.com/office/drawing/2016/5/12/chartex" xmlns:cx7="http://schemas.microsoft.com/office/drawing/2016/5/13/chartex" xmlns:cx8="http://schemas.microsoft.com/office/drawing/2016/5/14/chartex" xmlns:mc="http://schemas.openxmlformats.org/markup-compatibility/2006" xmlns:aink="http://schemas.microsoft.com/office/drawing/2016/ink" xmlns:am3d="http://schemas.microsoft.com/office/drawing/2017/model3d" xmlns:o="urn:schemas-microsoft-com:office:office" xmlns:oel="http://schemas.microsoft.com/office/2019/extlst" xmlns:r="http://schemas.openxmlformats.org/officeDocument/2006/relationships" xmlns:m="http://schemas.openxmlformats.org/officeDocument/2006/math" xmlns:v="urn:schemas-microsoft-com:vml" xmlns:wp14="http://schemas.microsoft.com/office/word/2010/wordprocessingDrawing" xmlns:wp="http://schemas.openxmlformats.org/drawingml/2006/wordprocessingDrawing" xmlns:w10="urn:schemas-microsoft-com:office:word" xmlns:w="http://schemas.openxmlformats.org/wordprocessingml/2006/main" xmlns:w14="http://schemas.microsoft.com/office/word/2010/wordml" xmlns:w15="http://schemas.microsoft.com/office/word/2012/wordml" xmlns:w16cex="http://schemas.microsoft.com/office/word/2018/wordml/cex" xmlns:w16cid="http://schemas.microsoft.com/office/word/2016/wordml/cid" xmlns:w16="http://schemas.microsoft.com/office/word/2018/wordml" xmlns:w16du="http://schemas.microsoft.com/office/word/2023/wordml/word16du" xmlns:w16sdtdh="http://schemas.microsoft.com/office/word/2020/wordml/sdtdatahash" xmlns:w16sdtfl="http://schemas.microsoft.com/office/word/2024/wordml/sdtformatlock" xmlns:w16se="http://schemas.microsoft.com/office/word/2015/wordml/symex" xmlns:wpg="http://schemas.microsoft.com/office/word/2010/wordprocessingGroup" xmlns:wpi="http://schemas.microsoft.com/office/word/2010/wordprocessingInk" xmlns:wne="http://schemas.microsoft.com/office/word/2006/wordml" xmlns:wps="http://schemas.microsoft.com/office/word/2010/wordprocessingShape" mc:Ignorable="w14 w15 w16se w16cid w16 w16cex w16sdtdh w16sdtfl w16du wp14">
+  <w:footnote w:type="separator" w:id="-1">
+    <w:p>
+      <w:pPr>
+        <w:spacing w:after="0" w:line="240" w:lineRule="auto"/>
+      </w:pPr>
+      <w:r>
+        <w:separator/>
+      </w:r>
+    </w:p>
+  </w:footnote>
+  <w:footnote w:type="continuationSeparator" w:id="0">
+    <w:p>
+      <w:pPr>
+        <w:spacing w:after="0" w:line="240" w:lineRule="auto"/>
+      </w:pPr>
+      <w:r>
+        <w:continuationSeparator/>
+      </w:r>
+    </w:p>
+  </w:footnote>
+</w:footnotes>
 </file>
 
 <file path=word/styles.xml><?xml version="1.0" encoding="utf-8"?>
@@ -1231,6 +1452,126 @@
       <w:rFonts w:ascii="Times New Roman" w:hAnsi="Times New Roman" w:cs="Times New Roman"/>
     </w:rPr>
   </w:style>
+  <w:style w:type="paragraph" w:styleId="Header">
+    <w:name w:val="header"/>
+    <w:basedOn w:val="Normal"/>
+    <w:link w:val="HeaderChar"/>
+    <w:uiPriority w:val="99"/>
+    <w:unhideWhenUsed/>
+    <w:rsid w:val="009A1770"/>
+    <w:pPr>
+      <w:tabs>
+        <w:tab w:val="center" w:pos="4680"/>
+        <w:tab w:val="right" w:pos="9360"/>
+      </w:tabs>
+      <w:spacing w:after="0" w:line="240" w:lineRule="auto"/>
+    </w:pPr>
+  </w:style>
+  <w:style w:type="character" w:customStyle="1" w:styleId="HeaderChar">
+    <w:name w:val="Header Char"/>
+    <w:basedOn w:val="DefaultParagraphFont"/>
+    <w:link w:val="Header"/>
+    <w:uiPriority w:val="99"/>
+    <w:rsid w:val="009A1770"/>
+  </w:style>
+  <w:style w:type="paragraph" w:styleId="Footer">
+    <w:name w:val="footer"/>
+    <w:basedOn w:val="Normal"/>
+    <w:link w:val="FooterChar"/>
+    <w:uiPriority w:val="99"/>
+    <w:unhideWhenUsed/>
+    <w:rsid w:val="009A1770"/>
+    <w:pPr>
+      <w:tabs>
+        <w:tab w:val="center" w:pos="4680"/>
+        <w:tab w:val="right" w:pos="9360"/>
+      </w:tabs>
+      <w:spacing w:after="0" w:line="240" w:lineRule="auto"/>
+    </w:pPr>
+  </w:style>
+  <w:style w:type="character" w:customStyle="1" w:styleId="FooterChar">
+    <w:name w:val="Footer Char"/>
+    <w:basedOn w:val="DefaultParagraphFont"/>
+    <w:link w:val="Footer"/>
+    <w:uiPriority w:val="99"/>
+    <w:rsid w:val="009A1770"/>
+  </w:style>
+  <w:style w:type="table" w:styleId="GridTable4-Accent1">
+    <w:name w:val="Grid Table 4 Accent 1"/>
+    <w:basedOn w:val="TableNormal"/>
+    <w:uiPriority w:val="49"/>
+    <w:rsid w:val="009A1770"/>
+    <w:pPr>
+      <w:spacing w:after="0" w:line="240" w:lineRule="auto"/>
+    </w:pPr>
+    <w:tblPr>
+      <w:tblStyleRowBandSize w:val="1"/>
+      <w:tblStyleColBandSize w:val="1"/>
+      <w:tblBorders>
+        <w:top w:val="single" w:sz="4" w:space="0" w:color="45B0E1" w:themeColor="accent1" w:themeTint="99"/>
+        <w:left w:val="single" w:sz="4" w:space="0" w:color="45B0E1" w:themeColor="accent1" w:themeTint="99"/>
+        <w:bottom w:val="single" w:sz="4" w:space="0" w:color="45B0E1" w:themeColor="accent1" w:themeTint="99"/>
+        <w:right w:val="single" w:sz="4" w:space="0" w:color="45B0E1" w:themeColor="accent1" w:themeTint="99"/>
+        <w:insideH w:val="single" w:sz="4" w:space="0" w:color="45B0E1" w:themeColor="accent1" w:themeTint="99"/>
+        <w:insideV w:val="single" w:sz="4" w:space="0" w:color="45B0E1" w:themeColor="accent1" w:themeTint="99"/>
+      </w:tblBorders>
+    </w:tblPr>
+    <w:tblStylePr w:type="firstRow">
+      <w:rPr>
+        <w:b/>
+        <w:bCs/>
+        <w:color w:val="FFFFFF" w:themeColor="background1"/>
+      </w:rPr>
+      <w:tblPr/>
+      <w:tcPr>
+        <w:tcBorders>
+          <w:top w:val="single" w:sz="4" w:space="0" w:color="156082" w:themeColor="accent1"/>
+          <w:left w:val="single" w:sz="4" w:space="0" w:color="156082" w:themeColor="accent1"/>
+          <w:bottom w:val="single" w:sz="4" w:space="0" w:color="156082" w:themeColor="accent1"/>
+          <w:right w:val="single" w:sz="4" w:space="0" w:color="156082" w:themeColor="accent1"/>
+          <w:insideH w:val="nil"/>
+          <w:insideV w:val="nil"/>
+        </w:tcBorders>
+        <w:shd w:val="clear" w:color="auto" w:fill="156082" w:themeFill="accent1"/>
+      </w:tcPr>
+    </w:tblStylePr>
+    <w:tblStylePr w:type="lastRow">
+      <w:rPr>
+        <w:b/>
+        <w:bCs/>
+      </w:rPr>
+      <w:tblPr/>
+      <w:tcPr>
+        <w:tcBorders>
+          <w:top w:val="double" w:sz="4" w:space="0" w:color="156082" w:themeColor="accent1"/>
+        </w:tcBorders>
+      </w:tcPr>
+    </w:tblStylePr>
+    <w:tblStylePr w:type="firstCol">
+      <w:rPr>
+        <w:b/>
+        <w:bCs/>
+      </w:rPr>
+    </w:tblStylePr>
+    <w:tblStylePr w:type="lastCol">
+      <w:rPr>
+        <w:b/>
+        <w:bCs/>
+      </w:rPr>
+    </w:tblStylePr>
+    <w:tblStylePr w:type="band1Vert">
+      <w:tblPr/>
+      <w:tcPr>
+        <w:shd w:val="clear" w:color="auto" w:fill="C1E4F5" w:themeFill="accent1" w:themeFillTint="33"/>
+      </w:tcPr>
+    </w:tblStylePr>
+    <w:tblStylePr w:type="band1Horz">
+      <w:tblPr/>
+      <w:tcPr>
+        <w:shd w:val="clear" w:color="auto" w:fill="C1E4F5" w:themeFill="accent1" w:themeFillTint="33"/>
+      </w:tcPr>
+    </w:tblStylePr>
+  </w:style>
 </w:styles>
 </file>
 

</xml_diff>